<commit_message>
Render segment preview progressively
Co-authored-by: Copilot <223556219+Copilot@users.noreply.github.com>
</commit_message>
<xml_diff>
--- a/documentation/CustomerInsightsSegmentSankey-SystemArchitecture.docx
+++ b/documentation/CustomerInsightsSegmentSankey-SystemArchitecture.docx
@@ -9659,22 +9659,29 @@
     </w:p>
     <w:p>
       <w:pPr>
-        <w:pStyle w:val="Listenabsatz"/>
-        <w:numPr>
-          <w:ilvl w:val="0"/>
-          <w:numId w:val="3"/>
-        </w:numPr>
-        <w:spacing w:after="80" w:line="280" w:lineRule="auto"/>
-      </w:pPr>
-      <w:r>
-        <w:t>The pane draws Sankey flows and calculates losses, additions, and retention.</w:t>
-      </w:r>
-    </w:p>
-    <w:p>
-      <w:pPr>
         <w:pStyle w:val="berschrift2"/>
+        <w:rPr>
+          <w:b w:val="0"/>
+          <w:bCs w:val="0"/>
+          <w:sz w:val="21"/>
+          <w:szCs w:val="21"/>
+        </w:rPr>
       </w:pPr>
       <w:bookmarkStart w:id="20" w:name="_Toc239245007"/>
+      <w:r>
+        <w:rPr>
+          <w:b w:val="0"/>
+          <w:bCs w:val="0"/>
+          <w:sz w:val="21"/>
+          <w:szCs w:val="21"/>
+        </w:rPr>
+        <w:t>The pane draws Sankey flows and calculates losses, additions, and retention. It renders accessible summary and flow placeholders immediately while counts are pending; an in-place refresh retains the last successful visualization until the replacement result is complete.</w:t>
+      </w:r>
+    </w:p>
+    <w:p>
+      <w:pPr>
+        <w:pStyle w:val="berschrift2"/>
+      </w:pPr>
       <w:r>
         <w:t>5.1 Example of a Verified Result</w:t>
       </w:r>

</xml_diff>

<commit_message>
Add privacy-safe performance diagnostics
Co-authored-by: Copilot <223556219+Copilot@users.noreply.github.com>
</commit_message>
<xml_diff>
--- a/documentation/CustomerInsightsSegmentSankey-SystemArchitecture.docx
+++ b/documentation/CustomerInsightsSegmentSankey-SystemArchitecture.docx
@@ -9677,6 +9677,15 @@
         </w:rPr>
         <w:t>The pane draws Sankey flows and calculates losses, additions, and retention. It renders accessible summary and flow placeholders immediately while counts are pending; an in-place refresh retains the last successful visualization until the replacement result is complete.</w:t>
       </w:r>
+      <w:r>
+        <w:rPr>
+          <w:b w:val="0"/>
+          <w:bCs w:val="0"/>
+          <w:sz w:val="21"/>
+          <w:szCs w:val="21"/>
+        </w:rPr>
+        <w:t xml:space="preserve"> The response also carries a versioned, sanitized performance-diagnostics envelope assembled from the same request: correlation ID, phase timings, bounded query-complexity counters, runtime state, and logical source tables.</w:t>
+      </w:r>
     </w:p>
     <w:p>
       <w:pPr>
@@ -15973,6 +15982,9 @@
     <w:p>
       <w:r>
         <w:t>The largest remaining latency comes from Fabric SQL cold starts and metadata/catalog work. A larger App Service plan with Always On only prevents Web App cold starts; Fabric Capacity has a separate availability and warm-start characteristic.</w:t>
+      </w:r>
+      <w:r>
+        <w:t xml:space="preserve"> The collapsed Performance diagnostics section formats this existing envelope during browser idle time and never starts another SQL or network request. Standard copies exclude filter expressions and values, MQL, member IDs, credentials, tokens, SAS data, and connection strings; stage counts are opt-in, and technical resource identifiers require explicit confirmation. Failure responses retain the same sanitized correlation and elapsed-phase data through a bounded diagnostic marker in the Dataverse plugin error contract.</w:t>
       </w:r>
     </w:p>
     <w:p>

</xml_diff>